<commit_message>
Renato Aragão: auditoria, HTML de voz e pacote de produção
Co-Authored-By: Claude Opus 5.5 <noreply@anthropic.com>
Claude-Session: https://claude.ai/code/session_01MJjUEEZrxQDEUifKK2vj9g
</commit_message>
<xml_diff>
--- a/roteiros/renato-aragao/RenatoAragao_Roteiro_Completo.docx
+++ b/roteiros/renato-aragao/RenatoAragao_Roteiro_Completo.docx
@@ -1695,7 +1695,7 @@
         <w:rPr>
           <w:color w:val="C00000"/>
         </w:rPr>
-        <w:t>Foi esse mesmo Victor Lustosa quem contou a frase mais sombria de todo o documentário. A frase que Renato teria dito sobre Dedé, Mussum e Zacarias. E, junto com ela, veio o relato de uma camareira sobre o que era deixado na cadeira de Mussum.</w:t>
+        <w:t>Foi esse mesmo Victor Lustosa quem contou a frase mais sombria de todo o documentário. A frase que Renato teria dito sobre os três parceiros. E, junto com ela, veio o relato de uma camareira sobre o que era deixado na cadeira de Mussum.</w:t>
       </w:r>
     </w:p>
     <w:p>
@@ -1711,7 +1711,7 @@
         <w:rPr>
           <w:color w:val="000000"/>
         </w:rPr>
-        <w:t>Dedé, Mussum e Zacarias tinham acabado de anunciar, no Teatro Fênix, que estavam deixando o Didi.</w:t>
+        <w:t>Os três parceiros tinham acabado de anunciar, no Teatro Fênix, que estavam deixando o Didi.</w:t>
       </w:r>
     </w:p>
     <w:p>

</xml_diff>